<commit_message>
Revise BiB submission after independent guideline review and archive v6 data/code DOI
</commit_message>
<xml_diff>
--- a/manuscript/Table_1_editable.docx
+++ b/manuscript/Table_1_editable.docx
@@ -4,219 +4,122 @@
   <w:body>
     <w:p>
       <w:pPr>
-        <w:pStyle w:val="Title"/>
+        <w:pStyle w:val="Heading1"/>
       </w:pPr>
       <w:r>
-        <w:t>Table 1</w:t>
+        <w:t>Table 1. Development reconstruction from the posterior mean</w:t>
       </w:r>
     </w:p>
     <w:p>
       <w:r>
-        <w:t>Development reconstruction from the posterior mean. Counts and errors use 701 target residues or 41 sequences. The autoregressive model has no corresponding reconstruction task.</w:t>
+        <w:t>Counts and errors use 701 target residues or 41 sequences. The autoregressive model has no corresponding reconstruction task. Model and metric definitions are given in notes a–c.</w:t>
       </w:r>
     </w:p>
     <w:tbl>
       <w:tblPr>
+        <w:tblStyle w:val="TableGrid"/>
         <w:tblW w:type="auto" w:w="0"/>
-        <w:jc w:val="center"/>
-        <w:tblLayout w:type="fixed"/>
         <w:tblLook w:firstColumn="1" w:firstRow="1" w:lastColumn="0" w:lastRow="0" w:noHBand="0" w:noVBand="1" w:val="04A0"/>
-        <w:tblBorders>
-          <w:top w:val="single" w:sz="4" w:color="D9D9D9"/>
-          <w:left w:val="single" w:sz="4" w:color="D9D9D9"/>
-          <w:bottom w:val="single" w:sz="4" w:color="D9D9D9"/>
-          <w:right w:val="single" w:sz="4" w:color="D9D9D9"/>
-          <w:insideH w:val="single" w:sz="4" w:color="D9D9D9"/>
-          <w:insideV w:val="single" w:sz="4" w:color="D9D9D9"/>
-        </w:tblBorders>
       </w:tblPr>
       <w:tblGrid>
-        <w:gridCol w:w="1656"/>
-        <w:gridCol w:w="1584"/>
-        <w:gridCol w:w="1584"/>
-        <w:gridCol w:w="1584"/>
-        <w:gridCol w:w="1584"/>
-        <w:gridCol w:w="1584"/>
+        <w:gridCol w:w="1587"/>
+        <w:gridCol w:w="1587"/>
+        <w:gridCol w:w="1587"/>
+        <w:gridCol w:w="1587"/>
+        <w:gridCol w:w="1587"/>
+        <w:gridCol w:w="1587"/>
       </w:tblGrid>
       <w:tr>
         <w:trPr>
-          <w:cantSplit/>
           <w:tblHeader/>
         </w:trPr>
         <w:tc>
           <w:tcPr>
-            <w:tcW w:type="dxa" w:w="1656"/>
-            <w:vAlign w:val="center"/>
-            <w:shd w:fill="E8EEF3"/>
-            <w:tcMar>
-              <w:top w:w="90" w:type="dxa"/>
-              <w:left w:w="90" w:type="dxa"/>
-              <w:bottom w:w="90" w:type="dxa"/>
-              <w:right w:w="90" w:type="dxa"/>
-            </w:tcMar>
+            <w:tcW w:type="dxa" w:w="1587"/>
           </w:tcPr>
           <w:p>
-            <w:pPr>
-              <w:spacing w:before="40" w:after="40" w:line="264" w:lineRule="auto"/>
-            </w:pPr>
             <w:r>
               <w:rPr>
-                <w:b/>
                 <w:sz w:val="18"/>
               </w:rPr>
-              <w:t>Model</w:t>
+              <w:t>Modelᵃ</w:t>
             </w:r>
           </w:p>
         </w:tc>
         <w:tc>
           <w:tcPr>
-            <w:tcW w:type="dxa" w:w="1584"/>
-            <w:vAlign w:val="center"/>
-            <w:shd w:fill="E8EEF3"/>
-            <w:tcMar>
-              <w:top w:w="90" w:type="dxa"/>
-              <w:left w:w="90" w:type="dxa"/>
-              <w:bottom w:w="90" w:type="dxa"/>
-              <w:right w:w="90" w:type="dxa"/>
-            </w:tcMar>
+            <w:tcW w:type="dxa" w:w="1587"/>
           </w:tcPr>
           <w:p>
-            <w:pPr>
-              <w:spacing w:before="40" w:after="40" w:line="264" w:lineRule="auto"/>
-            </w:pPr>
             <w:r>
               <w:rPr>
-                <w:b/>
                 <w:sz w:val="18"/>
               </w:rPr>
-              <w:t>Correct</w:t>
+              <w:t>Correctᵇ</w:t>
             </w:r>
           </w:p>
         </w:tc>
         <w:tc>
           <w:tcPr>
-            <w:tcW w:type="dxa" w:w="1584"/>
-            <w:vAlign w:val="center"/>
-            <w:shd w:fill="E8EEF3"/>
-            <w:tcMar>
-              <w:top w:w="90" w:type="dxa"/>
-              <w:left w:w="90" w:type="dxa"/>
-              <w:bottom w:w="90" w:type="dxa"/>
-              <w:right w:w="90" w:type="dxa"/>
-            </w:tcMar>
+            <w:tcW w:type="dxa" w:w="1587"/>
           </w:tcPr>
           <w:p>
-            <w:pPr>
-              <w:spacing w:before="40" w:after="40" w:line="264" w:lineRule="auto"/>
-            </w:pPr>
             <w:r>
               <w:rPr>
-                <w:b/>
                 <w:sz w:val="18"/>
               </w:rPr>
-              <w:t>Micro (%)</w:t>
+              <w:t>Micro (%)ᵇ</w:t>
             </w:r>
           </w:p>
         </w:tc>
         <w:tc>
           <w:tcPr>
-            <w:tcW w:type="dxa" w:w="1584"/>
-            <w:vAlign w:val="center"/>
-            <w:shd w:fill="E8EEF3"/>
-            <w:tcMar>
-              <w:top w:w="90" w:type="dxa"/>
-              <w:left w:w="90" w:type="dxa"/>
-              <w:bottom w:w="90" w:type="dxa"/>
-              <w:right w:w="90" w:type="dxa"/>
-            </w:tcMar>
+            <w:tcW w:type="dxa" w:w="1587"/>
           </w:tcPr>
           <w:p>
-            <w:pPr>
-              <w:spacing w:before="40" w:after="40" w:line="264" w:lineRule="auto"/>
-            </w:pPr>
             <w:r>
               <w:rPr>
-                <w:b/>
                 <w:sz w:val="18"/>
               </w:rPr>
-              <w:t>Macro (%)</w:t>
+              <w:t>Macro (%)ᵇ</w:t>
             </w:r>
           </w:p>
         </w:tc>
         <w:tc>
           <w:tcPr>
-            <w:tcW w:type="dxa" w:w="1584"/>
-            <w:vAlign w:val="center"/>
-            <w:shd w:fill="E8EEF3"/>
-            <w:tcMar>
-              <w:top w:w="90" w:type="dxa"/>
-              <w:left w:w="90" w:type="dxa"/>
-              <w:bottom w:w="90" w:type="dxa"/>
-              <w:right w:w="90" w:type="dxa"/>
-            </w:tcMar>
+            <w:tcW w:type="dxa" w:w="1587"/>
           </w:tcPr>
           <w:p>
-            <w:pPr>
-              <w:spacing w:before="40" w:after="40" w:line="264" w:lineRule="auto"/>
-            </w:pPr>
             <w:r>
               <w:rPr>
-                <w:b/>
                 <w:sz w:val="18"/>
               </w:rPr>
-              <w:t>Length MAE</w:t>
+              <w:t>Length MAEᶜ</w:t>
             </w:r>
           </w:p>
         </w:tc>
         <w:tc>
           <w:tcPr>
-            <w:tcW w:type="dxa" w:w="1584"/>
-            <w:vAlign w:val="center"/>
-            <w:shd w:fill="E8EEF3"/>
-            <w:tcMar>
-              <w:top w:w="90" w:type="dxa"/>
-              <w:left w:w="90" w:type="dxa"/>
-              <w:bottom w:w="90" w:type="dxa"/>
-              <w:right w:w="90" w:type="dxa"/>
-            </w:tcMar>
+            <w:tcW w:type="dxa" w:w="1587"/>
           </w:tcPr>
           <w:p>
-            <w:pPr>
-              <w:spacing w:before="40" w:after="40" w:line="264" w:lineRule="auto"/>
-            </w:pPr>
             <w:r>
               <w:rPr>
-                <w:b/>
                 <w:sz w:val="18"/>
               </w:rPr>
-              <w:t>Exact</w:t>
+              <w:t>Exactᶜ</w:t>
             </w:r>
           </w:p>
         </w:tc>
       </w:tr>
       <w:tr>
-        <w:trPr>
-          <w:cantSplit/>
-        </w:trPr>
         <w:tc>
           <w:tcPr>
-            <w:tcW w:type="dxa" w:w="1656"/>
-            <w:vAlign w:val="center"/>
-            <w:shd w:fill="FFFFFF"/>
-            <w:tcMar>
-              <w:top w:w="90" w:type="dxa"/>
-              <w:left w:w="90" w:type="dxa"/>
-              <w:bottom w:w="90" w:type="dxa"/>
-              <w:right w:w="90" w:type="dxa"/>
-            </w:tcMar>
+            <w:tcW w:type="dxa" w:w="1587"/>
           </w:tcPr>
           <w:p>
-            <w:pPr>
-              <w:spacing w:before="40" w:after="40" w:line="264" w:lineRule="auto"/>
-            </w:pPr>
             <w:r>
               <w:rPr>
-                <w:b w:val="0"/>
                 <w:sz w:val="18"/>
               </w:rPr>
               <w:t>CE21</w:t>
@@ -225,23 +128,14 @@
         </w:tc>
         <w:tc>
           <w:tcPr>
-            <w:tcW w:type="dxa" w:w="1584"/>
-            <w:vAlign w:val="center"/>
-            <w:shd w:fill="FFFFFF"/>
-            <w:tcMar>
-              <w:top w:w="90" w:type="dxa"/>
-              <w:left w:w="90" w:type="dxa"/>
-              <w:bottom w:w="90" w:type="dxa"/>
-              <w:right w:w="90" w:type="dxa"/>
-            </w:tcMar>
+            <w:tcW w:type="dxa" w:w="1587"/>
           </w:tcPr>
           <w:p>
             <w:pPr>
-              <w:spacing w:before="40" w:after="40" w:line="264" w:lineRule="auto"/>
+              <w:jc w:val="right"/>
             </w:pPr>
             <w:r>
               <w:rPr>
-                <w:b w:val="0"/>
                 <w:sz w:val="18"/>
               </w:rPr>
               <w:t>497/701</w:t>
@@ -250,23 +144,14 @@
         </w:tc>
         <w:tc>
           <w:tcPr>
-            <w:tcW w:type="dxa" w:w="1584"/>
-            <w:vAlign w:val="center"/>
-            <w:shd w:fill="FFFFFF"/>
-            <w:tcMar>
-              <w:top w:w="90" w:type="dxa"/>
-              <w:left w:w="90" w:type="dxa"/>
-              <w:bottom w:w="90" w:type="dxa"/>
-              <w:right w:w="90" w:type="dxa"/>
-            </w:tcMar>
+            <w:tcW w:type="dxa" w:w="1587"/>
           </w:tcPr>
           <w:p>
             <w:pPr>
-              <w:spacing w:before="40" w:after="40" w:line="264" w:lineRule="auto"/>
+              <w:jc w:val="right"/>
             </w:pPr>
             <w:r>
               <w:rPr>
-                <w:b w:val="0"/>
                 <w:sz w:val="18"/>
               </w:rPr>
               <w:t>70.90</w:t>
@@ -275,23 +160,14 @@
         </w:tc>
         <w:tc>
           <w:tcPr>
-            <w:tcW w:type="dxa" w:w="1584"/>
-            <w:vAlign w:val="center"/>
-            <w:shd w:fill="FFFFFF"/>
-            <w:tcMar>
-              <w:top w:w="90" w:type="dxa"/>
-              <w:left w:w="90" w:type="dxa"/>
-              <w:bottom w:w="90" w:type="dxa"/>
-              <w:right w:w="90" w:type="dxa"/>
-            </w:tcMar>
+            <w:tcW w:type="dxa" w:w="1587"/>
           </w:tcPr>
           <w:p>
             <w:pPr>
-              <w:spacing w:before="40" w:after="40" w:line="264" w:lineRule="auto"/>
+              <w:jc w:val="right"/>
             </w:pPr>
             <w:r>
               <w:rPr>
-                <w:b w:val="0"/>
                 <w:sz w:val="18"/>
               </w:rPr>
               <w:t>42.76</w:t>
@@ -300,23 +176,14 @@
         </w:tc>
         <w:tc>
           <w:tcPr>
-            <w:tcW w:type="dxa" w:w="1584"/>
-            <w:vAlign w:val="center"/>
-            <w:shd w:fill="FFFFFF"/>
-            <w:tcMar>
-              <w:top w:w="90" w:type="dxa"/>
-              <w:left w:w="90" w:type="dxa"/>
-              <w:bottom w:w="90" w:type="dxa"/>
-              <w:right w:w="90" w:type="dxa"/>
-            </w:tcMar>
+            <w:tcW w:type="dxa" w:w="1587"/>
           </w:tcPr>
           <w:p>
             <w:pPr>
-              <w:spacing w:before="40" w:after="40" w:line="264" w:lineRule="auto"/>
+              <w:jc w:val="right"/>
             </w:pPr>
             <w:r>
               <w:rPr>
-                <w:b w:val="0"/>
                 <w:sz w:val="18"/>
               </w:rPr>
               <w:t>0.000</w:t>
@@ -325,23 +192,14 @@
         </w:tc>
         <w:tc>
           <w:tcPr>
-            <w:tcW w:type="dxa" w:w="1584"/>
-            <w:vAlign w:val="center"/>
-            <w:shd w:fill="FFFFFF"/>
-            <w:tcMar>
-              <w:top w:w="90" w:type="dxa"/>
-              <w:left w:w="90" w:type="dxa"/>
-              <w:bottom w:w="90" w:type="dxa"/>
-              <w:right w:w="90" w:type="dxa"/>
-            </w:tcMar>
+            <w:tcW w:type="dxa" w:w="1587"/>
           </w:tcPr>
           <w:p>
             <w:pPr>
-              <w:spacing w:before="40" w:after="40" w:line="264" w:lineRule="auto"/>
+              <w:jc w:val="right"/>
             </w:pPr>
             <w:r>
               <w:rPr>
-                <w:b w:val="0"/>
                 <w:sz w:val="18"/>
               </w:rPr>
               <w:t>3/41</w:t>
@@ -350,28 +208,13 @@
         </w:tc>
       </w:tr>
       <w:tr>
-        <w:trPr>
-          <w:cantSplit/>
-        </w:trPr>
         <w:tc>
           <w:tcPr>
-            <w:tcW w:type="dxa" w:w="1656"/>
-            <w:vAlign w:val="center"/>
-            <w:shd w:fill="F7F9FB"/>
-            <w:tcMar>
-              <w:top w:w="90" w:type="dxa"/>
-              <w:left w:w="90" w:type="dxa"/>
-              <w:bottom w:w="90" w:type="dxa"/>
-              <w:right w:w="90" w:type="dxa"/>
-            </w:tcMar>
+            <w:tcW w:type="dxa" w:w="1587"/>
           </w:tcPr>
           <w:p>
-            <w:pPr>
-              <w:spacing w:before="40" w:after="40" w:line="264" w:lineRule="auto"/>
-            </w:pPr>
             <w:r>
               <w:rPr>
-                <w:b w:val="0"/>
                 <w:sz w:val="18"/>
               </w:rPr>
               <w:t>MSE21</w:t>
@@ -380,23 +223,14 @@
         </w:tc>
         <w:tc>
           <w:tcPr>
-            <w:tcW w:type="dxa" w:w="1584"/>
-            <w:vAlign w:val="center"/>
-            <w:shd w:fill="F7F9FB"/>
-            <w:tcMar>
-              <w:top w:w="90" w:type="dxa"/>
-              <w:left w:w="90" w:type="dxa"/>
-              <w:bottom w:w="90" w:type="dxa"/>
-              <w:right w:w="90" w:type="dxa"/>
-            </w:tcMar>
+            <w:tcW w:type="dxa" w:w="1587"/>
           </w:tcPr>
           <w:p>
             <w:pPr>
-              <w:spacing w:before="40" w:after="40" w:line="264" w:lineRule="auto"/>
+              <w:jc w:val="right"/>
             </w:pPr>
             <w:r>
               <w:rPr>
-                <w:b w:val="0"/>
                 <w:sz w:val="18"/>
               </w:rPr>
               <w:t>88/701</w:t>
@@ -405,23 +239,14 @@
         </w:tc>
         <w:tc>
           <w:tcPr>
-            <w:tcW w:type="dxa" w:w="1584"/>
-            <w:vAlign w:val="center"/>
-            <w:shd w:fill="F7F9FB"/>
-            <w:tcMar>
-              <w:top w:w="90" w:type="dxa"/>
-              <w:left w:w="90" w:type="dxa"/>
-              <w:bottom w:w="90" w:type="dxa"/>
-              <w:right w:w="90" w:type="dxa"/>
-            </w:tcMar>
+            <w:tcW w:type="dxa" w:w="1587"/>
           </w:tcPr>
           <w:p>
             <w:pPr>
-              <w:spacing w:before="40" w:after="40" w:line="264" w:lineRule="auto"/>
+              <w:jc w:val="right"/>
             </w:pPr>
             <w:r>
               <w:rPr>
-                <w:b w:val="0"/>
                 <w:sz w:val="18"/>
               </w:rPr>
               <w:t>12.55</w:t>
@@ -430,23 +255,14 @@
         </w:tc>
         <w:tc>
           <w:tcPr>
-            <w:tcW w:type="dxa" w:w="1584"/>
-            <w:vAlign w:val="center"/>
-            <w:shd w:fill="F7F9FB"/>
-            <w:tcMar>
-              <w:top w:w="90" w:type="dxa"/>
-              <w:left w:w="90" w:type="dxa"/>
-              <w:bottom w:w="90" w:type="dxa"/>
-              <w:right w:w="90" w:type="dxa"/>
-            </w:tcMar>
+            <w:tcW w:type="dxa" w:w="1587"/>
           </w:tcPr>
           <w:p>
             <w:pPr>
-              <w:spacing w:before="40" w:after="40" w:line="264" w:lineRule="auto"/>
+              <w:jc w:val="right"/>
             </w:pPr>
             <w:r>
               <w:rPr>
-                <w:b w:val="0"/>
                 <w:sz w:val="18"/>
               </w:rPr>
               <w:t>3.57</w:t>
@@ -455,23 +271,14 @@
         </w:tc>
         <w:tc>
           <w:tcPr>
-            <w:tcW w:type="dxa" w:w="1584"/>
-            <w:vAlign w:val="center"/>
-            <w:shd w:fill="F7F9FB"/>
-            <w:tcMar>
-              <w:top w:w="90" w:type="dxa"/>
-              <w:left w:w="90" w:type="dxa"/>
-              <w:bottom w:w="90" w:type="dxa"/>
-              <w:right w:w="90" w:type="dxa"/>
-            </w:tcMar>
+            <w:tcW w:type="dxa" w:w="1587"/>
           </w:tcPr>
           <w:p>
             <w:pPr>
-              <w:spacing w:before="40" w:after="40" w:line="264" w:lineRule="auto"/>
+              <w:jc w:val="right"/>
             </w:pPr>
             <w:r>
               <w:rPr>
-                <w:b w:val="0"/>
                 <w:sz w:val="18"/>
               </w:rPr>
               <w:t>5.561</w:t>
@@ -480,23 +287,14 @@
         </w:tc>
         <w:tc>
           <w:tcPr>
-            <w:tcW w:type="dxa" w:w="1584"/>
-            <w:vAlign w:val="center"/>
-            <w:shd w:fill="F7F9FB"/>
-            <w:tcMar>
-              <w:top w:w="90" w:type="dxa"/>
-              <w:left w:w="90" w:type="dxa"/>
-              <w:bottom w:w="90" w:type="dxa"/>
-              <w:right w:w="90" w:type="dxa"/>
-            </w:tcMar>
+            <w:tcW w:type="dxa" w:w="1587"/>
           </w:tcPr>
           <w:p>
             <w:pPr>
-              <w:spacing w:before="40" w:after="40" w:line="264" w:lineRule="auto"/>
+              <w:jc w:val="right"/>
             </w:pPr>
             <w:r>
               <w:rPr>
-                <w:b w:val="0"/>
                 <w:sz w:val="18"/>
               </w:rPr>
               <w:t>0/41</w:t>
@@ -505,28 +303,13 @@
         </w:tc>
       </w:tr>
       <w:tr>
-        <w:trPr>
-          <w:cantSplit/>
-        </w:trPr>
         <w:tc>
           <w:tcPr>
-            <w:tcW w:type="dxa" w:w="1656"/>
-            <w:vAlign w:val="center"/>
-            <w:shd w:fill="FFFFFF"/>
-            <w:tcMar>
-              <w:top w:w="90" w:type="dxa"/>
-              <w:left w:w="90" w:type="dxa"/>
-              <w:bottom w:w="90" w:type="dxa"/>
-              <w:right w:w="90" w:type="dxa"/>
-            </w:tcMar>
+            <w:tcW w:type="dxa" w:w="1587"/>
           </w:tcPr>
           <w:p>
-            <w:pPr>
-              <w:spacing w:before="40" w:after="40" w:line="264" w:lineRule="auto"/>
-            </w:pPr>
             <w:r>
               <w:rPr>
-                <w:b w:val="0"/>
                 <w:sz w:val="18"/>
               </w:rPr>
               <w:t>Scalar</w:t>
@@ -535,23 +318,14 @@
         </w:tc>
         <w:tc>
           <w:tcPr>
-            <w:tcW w:type="dxa" w:w="1584"/>
-            <w:vAlign w:val="center"/>
-            <w:shd w:fill="FFFFFF"/>
-            <w:tcMar>
-              <w:top w:w="90" w:type="dxa"/>
-              <w:left w:w="90" w:type="dxa"/>
-              <w:bottom w:w="90" w:type="dxa"/>
-              <w:right w:w="90" w:type="dxa"/>
-            </w:tcMar>
+            <w:tcW w:type="dxa" w:w="1587"/>
           </w:tcPr>
           <w:p>
             <w:pPr>
-              <w:spacing w:before="40" w:after="40" w:line="264" w:lineRule="auto"/>
+              <w:jc w:val="right"/>
             </w:pPr>
             <w:r>
               <w:rPr>
-                <w:b w:val="0"/>
                 <w:sz w:val="18"/>
               </w:rPr>
               <w:t>111/701</w:t>
@@ -560,23 +334,14 @@
         </w:tc>
         <w:tc>
           <w:tcPr>
-            <w:tcW w:type="dxa" w:w="1584"/>
-            <w:vAlign w:val="center"/>
-            <w:shd w:fill="FFFFFF"/>
-            <w:tcMar>
-              <w:top w:w="90" w:type="dxa"/>
-              <w:left w:w="90" w:type="dxa"/>
-              <w:bottom w:w="90" w:type="dxa"/>
-              <w:right w:w="90" w:type="dxa"/>
-            </w:tcMar>
+            <w:tcW w:type="dxa" w:w="1587"/>
           </w:tcPr>
           <w:p>
             <w:pPr>
-              <w:spacing w:before="40" w:after="40" w:line="264" w:lineRule="auto"/>
+              <w:jc w:val="right"/>
             </w:pPr>
             <w:r>
               <w:rPr>
-                <w:b w:val="0"/>
                 <w:sz w:val="18"/>
               </w:rPr>
               <w:t>15.83</w:t>
@@ -585,23 +350,14 @@
         </w:tc>
         <w:tc>
           <w:tcPr>
-            <w:tcW w:type="dxa" w:w="1584"/>
-            <w:vAlign w:val="center"/>
-            <w:shd w:fill="FFFFFF"/>
-            <w:tcMar>
-              <w:top w:w="90" w:type="dxa"/>
-              <w:left w:w="90" w:type="dxa"/>
-              <w:bottom w:w="90" w:type="dxa"/>
-              <w:right w:w="90" w:type="dxa"/>
-            </w:tcMar>
+            <w:tcW w:type="dxa" w:w="1587"/>
           </w:tcPr>
           <w:p>
             <w:pPr>
-              <w:spacing w:before="40" w:after="40" w:line="264" w:lineRule="auto"/>
+              <w:jc w:val="right"/>
             </w:pPr>
             <w:r>
               <w:rPr>
-                <w:b w:val="0"/>
                 <w:sz w:val="18"/>
               </w:rPr>
               <w:t>8.05</w:t>
@@ -610,23 +366,14 @@
         </w:tc>
         <w:tc>
           <w:tcPr>
-            <w:tcW w:type="dxa" w:w="1584"/>
-            <w:vAlign w:val="center"/>
-            <w:shd w:fill="FFFFFF"/>
-            <w:tcMar>
-              <w:top w:w="90" w:type="dxa"/>
-              <w:left w:w="90" w:type="dxa"/>
-              <w:bottom w:w="90" w:type="dxa"/>
-              <w:right w:w="90" w:type="dxa"/>
-            </w:tcMar>
+            <w:tcW w:type="dxa" w:w="1587"/>
           </w:tcPr>
           <w:p>
             <w:pPr>
-              <w:spacing w:before="40" w:after="40" w:line="264" w:lineRule="auto"/>
+              <w:jc w:val="right"/>
             </w:pPr>
             <w:r>
               <w:rPr>
-                <w:b w:val="0"/>
                 <w:sz w:val="18"/>
               </w:rPr>
               <w:t>1.341</w:t>
@@ -635,23 +382,14 @@
         </w:tc>
         <w:tc>
           <w:tcPr>
-            <w:tcW w:type="dxa" w:w="1584"/>
-            <w:vAlign w:val="center"/>
-            <w:shd w:fill="FFFFFF"/>
-            <w:tcMar>
-              <w:top w:w="90" w:type="dxa"/>
-              <w:left w:w="90" w:type="dxa"/>
-              <w:bottom w:w="90" w:type="dxa"/>
-              <w:right w:w="90" w:type="dxa"/>
-            </w:tcMar>
+            <w:tcW w:type="dxa" w:w="1587"/>
           </w:tcPr>
           <w:p>
             <w:pPr>
-              <w:spacing w:before="40" w:after="40" w:line="264" w:lineRule="auto"/>
+              <w:jc w:val="right"/>
             </w:pPr>
             <w:r>
               <w:rPr>
-                <w:b w:val="0"/>
                 <w:sz w:val="18"/>
               </w:rPr>
               <w:t>0/41</w:t>
@@ -661,42 +399,28 @@
       </w:tr>
     </w:tbl>
     <w:p>
-      <w:pPr>
-        <w:spacing w:after="0"/>
-      </w:pPr>
+      <w:r>
+        <w:t>a. CE21: 21-category cross-entropy; MSE21: 21-category mean-squared error; scalar: residue-number regression pipeline.</w:t>
+      </w:r>
     </w:p>
     <w:p>
       <w:r>
-        <w:t>Micro: residue-level accuracy. Macro: mean recall over target-supported amino-acid classes. Length MAE: mean absolute length error. Exact: whole-sequence matches.</w:t>
+        <w:t>b. Correct: aligned correct target residues out of 701; micro: percentage over those residues; macro: mean recall across target-supported amino-acid classes.</w:t>
+      </w:r>
+    </w:p>
+    <w:p>
+      <w:r>
+        <w:t>c. Length MAE: mean absolute length error in residues over 41 sequences; exact: whole-sequence matches out of 41. Source: Table S1 and the accompanying reconstruction records.</w:t>
       </w:r>
     </w:p>
     <w:sectPr>
-      <w:footerReference w:type="default" r:id="rId9"/>
-      <w:pgSz w:w="11909" w:h="16834"/>
-      <w:pgMar w:top="1051" w:right="1123" w:bottom="1051" w:left="1123" w:header="720" w:footer="720" w:gutter="0"/>
+      <w:pgSz w:w="11906" w:h="16838"/>
+      <w:pgMar w:top="1134" w:right="1191" w:bottom="1134" w:left="1191" w:header="720" w:footer="720" w:gutter="0"/>
       <w:cols w:space="720"/>
       <w:docGrid w:linePitch="360"/>
     </w:sectPr>
   </w:body>
 </w:document>
-</file>
-
-<file path=word/footer1.xml><?xml version="1.0" encoding="utf-8"?>
-<w:ftr xmlns:m="http://schemas.openxmlformats.org/officeDocument/2006/math" xmlns:mc="http://schemas.openxmlformats.org/markup-compatibility/2006" xmlns:mo="http://schemas.microsoft.com/office/mac/office/2008/main" xmlns:mv="urn:schemas-microsoft-com:mac:vml" xmlns:o="urn:schemas-microsoft-com:office:office" xmlns:r="http://schemas.openxmlformats.org/officeDocument/2006/relationships" xmlns:v="urn:schemas-microsoft-com:vml" xmlns:w10="urn:schemas-microsoft-com:office:word" xmlns:w14="http://schemas.microsoft.com/office/word/2010/wordml" xmlns:w="http://schemas.openxmlformats.org/wordprocessingml/2006/main" xmlns:wne="http://schemas.microsoft.com/office/word/2006/wordml" xmlns:wp14="http://schemas.microsoft.com/office/word/2010/wordprocessingDrawing" xmlns:wp="http://schemas.openxmlformats.org/drawingml/2006/wordprocessingDrawing" xmlns:wpc="http://schemas.microsoft.com/office/word/2010/wordprocessingCanvas" xmlns:wpg="http://schemas.microsoft.com/office/word/2010/wordprocessingGroup" xmlns:wpi="http://schemas.microsoft.com/office/word/2010/wordprocessingInk" xmlns:wps="http://schemas.microsoft.com/office/word/2010/wordprocessingShape" mc:Ignorable="w14 wp14">
-  <w:p>
-    <w:pPr>
-      <w:pStyle w:val="Footer"/>
-      <w:jc w:val="right"/>
-    </w:pPr>
-    <w:r>
-      <w:rPr>
-        <w:sz w:val="16"/>
-      </w:rPr>
-      <w:t xml:space="preserve">AMP Table 1  |  </w:t>
-    </w:r>
-    <w:fldSimple w:instr="PAGE"/>
-  </w:p>
-</w:ftr>
 </file>
 
 <file path=word/numbering.xml><?xml version="1.0" encoding="utf-8"?>
@@ -907,7 +631,7 @@
   <w:docDefaults>
     <w:rPrDefault>
       <w:rPr>
-        <w:rFonts w:cstheme="minorBidi" w:eastAsia="Heiti SC"/>
+        <w:rFonts w:asciiTheme="minorHAnsi" w:eastAsiaTheme="minorEastAsia" w:hAnsiTheme="minorHAnsi" w:cstheme="minorBidi"/>
         <w:sz w:val="22"/>
         <w:szCs w:val="22"/>
         <w:lang w:val="en-US" w:eastAsia="en-US" w:bidi="ar-SA"/>
@@ -1063,11 +787,10 @@
     <w:qFormat/>
     <w:rsid w:val="00FC693F"/>
     <w:pPr>
-      <w:spacing w:after="140" w:line="293" w:lineRule="auto"/>
+      <w:spacing w:after="120"/>
     </w:pPr>
     <w:rPr>
-      <w:rFonts w:ascii="Arial" w:hAnsi="Arial" w:eastAsia="Heiti SC"/>
-      <w:color w:val="000000"/>
+      <w:rFonts w:ascii="Arial" w:hAnsi="Arial"/>
       <w:sz w:val="21"/>
     </w:rPr>
   </w:style>
@@ -1126,14 +849,14 @@
     <w:pPr>
       <w:keepNext/>
       <w:keepLines/>
-      <w:spacing w:before="240" w:after="140" w:line="293" w:lineRule="auto"/>
+      <w:spacing w:before="480" w:after="0"/>
       <w:outlineLvl w:val="0"/>
     </w:pPr>
     <w:rPr>
-      <w:rFonts w:cstheme="majorBidi" w:ascii="Arial" w:hAnsi="Arial" w:eastAsia="Heiti SC"/>
+      <w:rFonts w:asciiTheme="majorHAnsi" w:eastAsiaTheme="majorEastAsia" w:hAnsiTheme="majorHAnsi" w:cstheme="majorBidi"/>
       <w:b/>
       <w:bCs/>
-      <w:color w:val="000000"/>
+      <w:color w:val="365F91" w:themeColor="accent1" w:themeShade="BF"/>
       <w:sz w:val="28"/>
       <w:szCs w:val="28"/>
     </w:rPr>
@@ -1150,15 +873,15 @@
     <w:pPr>
       <w:keepNext/>
       <w:keepLines/>
-      <w:spacing w:before="240" w:after="140" w:line="293" w:lineRule="auto"/>
+      <w:spacing w:before="200" w:after="0"/>
       <w:outlineLvl w:val="1"/>
     </w:pPr>
     <w:rPr>
-      <w:rFonts w:cstheme="majorBidi" w:ascii="Arial" w:hAnsi="Arial" w:eastAsia="Heiti SC"/>
+      <w:rFonts w:asciiTheme="majorHAnsi" w:eastAsiaTheme="majorEastAsia" w:hAnsiTheme="majorHAnsi" w:cstheme="majorBidi"/>
       <w:b/>
       <w:bCs/>
-      <w:color w:val="000000"/>
-      <w:sz w:val="24"/>
+      <w:color w:val="4F81BD" w:themeColor="accent1"/>
+      <w:sz w:val="26"/>
       <w:szCs w:val="26"/>
     </w:rPr>
   </w:style>
@@ -1178,7 +901,7 @@
       <w:outlineLvl w:val="2"/>
     </w:pPr>
     <w:rPr>
-      <w:rFonts w:cstheme="majorBidi" w:eastAsia="Heiti SC"/>
+      <w:rFonts w:asciiTheme="majorHAnsi" w:eastAsiaTheme="majorEastAsia" w:hAnsiTheme="majorHAnsi" w:cstheme="majorBidi"/>
       <w:b/>
       <w:bCs/>
       <w:color w:val="4F81BD" w:themeColor="accent1"/>
@@ -1201,7 +924,7 @@
       <w:outlineLvl w:val="3"/>
     </w:pPr>
     <w:rPr>
-      <w:rFonts w:cstheme="majorBidi" w:eastAsia="Heiti SC"/>
+      <w:rFonts w:asciiTheme="majorHAnsi" w:eastAsiaTheme="majorEastAsia" w:hAnsiTheme="majorHAnsi" w:cstheme="majorBidi"/>
       <w:b/>
       <w:bCs/>
       <w:i/>
@@ -1226,7 +949,7 @@
       <w:outlineLvl w:val="4"/>
     </w:pPr>
     <w:rPr>
-      <w:rFonts w:cstheme="majorBidi" w:eastAsia="Heiti SC"/>
+      <w:rFonts w:asciiTheme="majorHAnsi" w:eastAsiaTheme="majorEastAsia" w:hAnsiTheme="majorHAnsi" w:cstheme="majorBidi"/>
       <w:color w:val="243F60" w:themeColor="accent1" w:themeShade="7F"/>
     </w:rPr>
   </w:style>
@@ -1247,7 +970,7 @@
       <w:outlineLvl w:val="5"/>
     </w:pPr>
     <w:rPr>
-      <w:rFonts w:cstheme="majorBidi" w:eastAsia="Heiti SC"/>
+      <w:rFonts w:asciiTheme="majorHAnsi" w:eastAsiaTheme="majorEastAsia" w:hAnsiTheme="majorHAnsi" w:cstheme="majorBidi"/>
       <w:i/>
       <w:iCs/>
       <w:color w:val="243F60" w:themeColor="accent1" w:themeShade="7F"/>
@@ -1270,7 +993,7 @@
       <w:outlineLvl w:val="6"/>
     </w:pPr>
     <w:rPr>
-      <w:rFonts w:cstheme="majorBidi" w:eastAsia="Heiti SC"/>
+      <w:rFonts w:asciiTheme="majorHAnsi" w:eastAsiaTheme="majorEastAsia" w:hAnsiTheme="majorHAnsi" w:cstheme="majorBidi"/>
       <w:i/>
       <w:iCs/>
       <w:color w:val="404040" w:themeColor="text1" w:themeTint="BF"/>
@@ -1293,7 +1016,7 @@
       <w:outlineLvl w:val="7"/>
     </w:pPr>
     <w:rPr>
-      <w:rFonts w:cstheme="majorBidi" w:eastAsia="Heiti SC"/>
+      <w:rFonts w:asciiTheme="majorHAnsi" w:eastAsiaTheme="majorEastAsia" w:hAnsiTheme="majorHAnsi" w:cstheme="majorBidi"/>
       <w:color w:val="4F81BD" w:themeColor="accent1"/>
       <w:sz w:val="20"/>
       <w:szCs w:val="20"/>
@@ -1316,7 +1039,7 @@
       <w:outlineLvl w:val="8"/>
     </w:pPr>
     <w:rPr>
-      <w:rFonts w:cstheme="majorBidi" w:eastAsia="Heiti SC"/>
+      <w:rFonts w:asciiTheme="majorHAnsi" w:eastAsiaTheme="majorEastAsia" w:hAnsiTheme="majorHAnsi" w:cstheme="majorBidi"/>
       <w:i/>
       <w:iCs/>
       <w:color w:val="404040" w:themeColor="text1" w:themeTint="BF"/>
@@ -1367,7 +1090,7 @@
     <w:uiPriority w:val="9"/>
     <w:rsid w:val="00FC693F"/>
     <w:rPr>
-      <w:rFonts w:cstheme="majorBidi" w:eastAsia="Heiti SC"/>
+      <w:rFonts w:asciiTheme="majorHAnsi" w:eastAsiaTheme="majorEastAsia" w:hAnsiTheme="majorHAnsi" w:cstheme="majorBidi"/>
       <w:b/>
       <w:bCs/>
       <w:color w:val="365F91" w:themeColor="accent1" w:themeShade="BF"/>
@@ -1382,7 +1105,7 @@
     <w:uiPriority w:val="9"/>
     <w:rsid w:val="00FC693F"/>
     <w:rPr>
-      <w:rFonts w:cstheme="majorBidi" w:eastAsia="Heiti SC"/>
+      <w:rFonts w:asciiTheme="majorHAnsi" w:eastAsiaTheme="majorEastAsia" w:hAnsiTheme="majorHAnsi" w:cstheme="majorBidi"/>
       <w:b/>
       <w:bCs/>
       <w:color w:val="4F81BD" w:themeColor="accent1"/>
@@ -1397,7 +1120,7 @@
     <w:uiPriority w:val="9"/>
     <w:rsid w:val="00FC693F"/>
     <w:rPr>
-      <w:rFonts w:cstheme="majorBidi" w:eastAsia="Heiti SC"/>
+      <w:rFonts w:asciiTheme="majorHAnsi" w:eastAsiaTheme="majorEastAsia" w:hAnsiTheme="majorHAnsi" w:cstheme="majorBidi"/>
       <w:b/>
       <w:bCs/>
       <w:color w:val="4F81BD" w:themeColor="accent1"/>
@@ -1412,15 +1135,15 @@
     <w:qFormat/>
     <w:rsid w:val="00FC693F"/>
     <w:pPr>
-      <w:spacing w:after="140" w:line="293" w:lineRule="auto"/>
+      <w:spacing w:after="300" w:line="240" w:lineRule="auto"/>
       <w:contextualSpacing/>
     </w:pPr>
     <w:rPr>
-      <w:rFonts w:cstheme="majorBidi" w:ascii="Arial" w:hAnsi="Arial" w:eastAsia="Heiti SC"/>
-      <w:color w:val="000000"/>
+      <w:rFonts w:asciiTheme="majorHAnsi" w:eastAsiaTheme="majorEastAsia" w:hAnsiTheme="majorHAnsi" w:cstheme="majorBidi"/>
+      <w:color w:val="17365D" w:themeColor="text2" w:themeShade="BF"/>
       <w:spacing w:val="5"/>
       <w:kern w:val="28"/>
-      <w:sz w:val="44"/>
+      <w:sz w:val="52"/>
       <w:szCs w:val="52"/>
     </w:rPr>
   </w:style>
@@ -1431,7 +1154,7 @@
     <w:uiPriority w:val="10"/>
     <w:rsid w:val="00FC693F"/>
     <w:rPr>
-      <w:rFonts w:cstheme="majorBidi" w:eastAsia="Heiti SC"/>
+      <w:rFonts w:asciiTheme="majorHAnsi" w:eastAsiaTheme="majorEastAsia" w:hAnsiTheme="majorHAnsi" w:cstheme="majorBidi"/>
       <w:color w:val="17365D" w:themeColor="text2" w:themeShade="BF"/>
       <w:spacing w:val="5"/>
       <w:kern w:val="28"/>
@@ -1451,15 +1174,14 @@
       <w:numPr>
         <w:ilvl w:val="1"/>
       </w:numPr>
-      <w:spacing w:after="140" w:line="293" w:lineRule="auto"/>
     </w:pPr>
     <w:rPr>
-      <w:rFonts w:cstheme="majorBidi" w:ascii="Arial" w:hAnsi="Arial" w:eastAsia="Heiti SC"/>
+      <w:rFonts w:asciiTheme="majorHAnsi" w:eastAsiaTheme="majorEastAsia" w:hAnsiTheme="majorHAnsi" w:cstheme="majorBidi"/>
       <w:i/>
       <w:iCs/>
-      <w:color w:val="000000"/>
+      <w:color w:val="4F81BD" w:themeColor="accent1"/>
       <w:spacing w:val="15"/>
-      <w:sz w:val="20"/>
+      <w:sz w:val="24"/>
       <w:szCs w:val="24"/>
     </w:rPr>
   </w:style>
@@ -1470,7 +1192,7 @@
     <w:uiPriority w:val="11"/>
     <w:rsid w:val="00FC693F"/>
     <w:rPr>
-      <w:rFonts w:cstheme="majorBidi" w:eastAsia="Heiti SC"/>
+      <w:rFonts w:asciiTheme="majorHAnsi" w:eastAsiaTheme="majorEastAsia" w:hAnsiTheme="majorHAnsi" w:cstheme="majorBidi"/>
       <w:i/>
       <w:iCs/>
       <w:color w:val="4F81BD" w:themeColor="accent1"/>
@@ -1717,7 +1439,7 @@
       </w:tabs>
     </w:pPr>
     <w:rPr>
-      <w:rFonts w:ascii="Courier" w:hAnsi="Courier" w:eastAsia="Heiti SC"/>
+      <w:rFonts w:ascii="Courier" w:hAnsi="Courier"/>
       <w:sz w:val="20"/>
       <w:szCs w:val="20"/>
     </w:rPr>
@@ -1729,7 +1451,7 @@
     <w:uiPriority w:val="99"/>
     <w:rsid w:val="0029639D"/>
     <w:rPr>
-      <w:rFonts w:ascii="Courier" w:hAnsi="Courier" w:eastAsia="Heiti SC"/>
+      <w:rFonts w:ascii="Courier" w:hAnsi="Courier"/>
       <w:sz w:val="20"/>
       <w:szCs w:val="20"/>
     </w:rPr>
@@ -1768,7 +1490,7 @@
     <w:semiHidden/>
     <w:rsid w:val="00FC693F"/>
     <w:rPr>
-      <w:rFonts w:cstheme="majorBidi" w:eastAsia="Heiti SC"/>
+      <w:rFonts w:asciiTheme="majorHAnsi" w:eastAsiaTheme="majorEastAsia" w:hAnsiTheme="majorHAnsi" w:cstheme="majorBidi"/>
       <w:b/>
       <w:bCs/>
       <w:i/>
@@ -1784,7 +1506,7 @@
     <w:semiHidden/>
     <w:rsid w:val="00FC693F"/>
     <w:rPr>
-      <w:rFonts w:cstheme="majorBidi" w:eastAsia="Heiti SC"/>
+      <w:rFonts w:asciiTheme="majorHAnsi" w:eastAsiaTheme="majorEastAsia" w:hAnsiTheme="majorHAnsi" w:cstheme="majorBidi"/>
       <w:color w:val="243F60" w:themeColor="accent1" w:themeShade="7F"/>
     </w:rPr>
   </w:style>
@@ -1796,7 +1518,7 @@
     <w:semiHidden/>
     <w:rsid w:val="00FC693F"/>
     <w:rPr>
-      <w:rFonts w:cstheme="majorBidi" w:eastAsia="Heiti SC"/>
+      <w:rFonts w:asciiTheme="majorHAnsi" w:eastAsiaTheme="majorEastAsia" w:hAnsiTheme="majorHAnsi" w:cstheme="majorBidi"/>
       <w:i/>
       <w:iCs/>
       <w:color w:val="243F60" w:themeColor="accent1" w:themeShade="7F"/>
@@ -1810,7 +1532,7 @@
     <w:semiHidden/>
     <w:rsid w:val="00FC693F"/>
     <w:rPr>
-      <w:rFonts w:cstheme="majorBidi" w:eastAsia="Heiti SC"/>
+      <w:rFonts w:asciiTheme="majorHAnsi" w:eastAsiaTheme="majorEastAsia" w:hAnsiTheme="majorHAnsi" w:cstheme="majorBidi"/>
       <w:i/>
       <w:iCs/>
       <w:color w:val="404040" w:themeColor="text1" w:themeTint="BF"/>
@@ -1824,7 +1546,7 @@
     <w:semiHidden/>
     <w:rsid w:val="00FC693F"/>
     <w:rPr>
-      <w:rFonts w:cstheme="majorBidi" w:eastAsia="Heiti SC"/>
+      <w:rFonts w:asciiTheme="majorHAnsi" w:eastAsiaTheme="majorEastAsia" w:hAnsiTheme="majorHAnsi" w:cstheme="majorBidi"/>
       <w:color w:val="4F81BD" w:themeColor="accent1"/>
       <w:sz w:val="20"/>
       <w:szCs w:val="20"/>
@@ -1838,7 +1560,7 @@
     <w:semiHidden/>
     <w:rsid w:val="00FC693F"/>
     <w:rPr>
-      <w:rFonts w:cstheme="majorBidi" w:eastAsia="Heiti SC"/>
+      <w:rFonts w:asciiTheme="majorHAnsi" w:eastAsiaTheme="majorEastAsia" w:hAnsiTheme="majorHAnsi" w:cstheme="majorBidi"/>
       <w:i/>
       <w:iCs/>
       <w:color w:val="404040" w:themeColor="text1" w:themeTint="BF"/>
@@ -3424,7 +3146,7 @@
         <w:spacing w:before="0" w:after="0" w:line="240" w:lineRule="auto"/>
       </w:pPr>
       <w:rPr>
-        <w:rFonts w:cstheme="majorBidi" w:eastAsia="Heiti SC"/>
+        <w:rFonts w:asciiTheme="majorHAnsi" w:eastAsiaTheme="majorEastAsia" w:hAnsiTheme="majorHAnsi" w:cstheme="majorBidi"/>
         <w:b/>
         <w:bCs/>
       </w:rPr>
@@ -3445,7 +3167,7 @@
         <w:spacing w:before="0" w:after="0" w:line="240" w:lineRule="auto"/>
       </w:pPr>
       <w:rPr>
-        <w:rFonts w:cstheme="majorBidi" w:eastAsia="Heiti SC"/>
+        <w:rFonts w:asciiTheme="majorHAnsi" w:eastAsiaTheme="majorEastAsia" w:hAnsiTheme="majorHAnsi" w:cstheme="majorBidi"/>
         <w:b/>
         <w:bCs/>
       </w:rPr>
@@ -3463,14 +3185,14 @@
     </w:tblStylePr>
     <w:tblStylePr w:type="firstCol">
       <w:rPr>
-        <w:rFonts w:cstheme="majorBidi" w:eastAsia="Heiti SC"/>
+        <w:rFonts w:asciiTheme="majorHAnsi" w:eastAsiaTheme="majorEastAsia" w:hAnsiTheme="majorHAnsi" w:cstheme="majorBidi"/>
         <w:b/>
         <w:bCs/>
       </w:rPr>
     </w:tblStylePr>
     <w:tblStylePr w:type="lastCol">
       <w:rPr>
-        <w:rFonts w:cstheme="majorBidi" w:eastAsia="Heiti SC"/>
+        <w:rFonts w:asciiTheme="majorHAnsi" w:eastAsiaTheme="majorEastAsia" w:hAnsiTheme="majorHAnsi" w:cstheme="majorBidi"/>
         <w:b/>
         <w:bCs/>
       </w:rPr>
@@ -3554,7 +3276,7 @@
         <w:spacing w:before="0" w:after="0" w:line="240" w:lineRule="auto"/>
       </w:pPr>
       <w:rPr>
-        <w:rFonts w:cstheme="majorBidi" w:eastAsia="Heiti SC"/>
+        <w:rFonts w:asciiTheme="majorHAnsi" w:eastAsiaTheme="majorEastAsia" w:hAnsiTheme="majorHAnsi" w:cstheme="majorBidi"/>
         <w:b/>
         <w:bCs/>
       </w:rPr>
@@ -3575,7 +3297,7 @@
         <w:spacing w:before="0" w:after="0" w:line="240" w:lineRule="auto"/>
       </w:pPr>
       <w:rPr>
-        <w:rFonts w:cstheme="majorBidi" w:eastAsia="Heiti SC"/>
+        <w:rFonts w:asciiTheme="majorHAnsi" w:eastAsiaTheme="majorEastAsia" w:hAnsiTheme="majorHAnsi" w:cstheme="majorBidi"/>
         <w:b/>
         <w:bCs/>
       </w:rPr>
@@ -3593,14 +3315,14 @@
     </w:tblStylePr>
     <w:tblStylePr w:type="firstCol">
       <w:rPr>
-        <w:rFonts w:cstheme="majorBidi" w:eastAsia="Heiti SC"/>
+        <w:rFonts w:asciiTheme="majorHAnsi" w:eastAsiaTheme="majorEastAsia" w:hAnsiTheme="majorHAnsi" w:cstheme="majorBidi"/>
         <w:b/>
         <w:bCs/>
       </w:rPr>
     </w:tblStylePr>
     <w:tblStylePr w:type="lastCol">
       <w:rPr>
-        <w:rFonts w:cstheme="majorBidi" w:eastAsia="Heiti SC"/>
+        <w:rFonts w:asciiTheme="majorHAnsi" w:eastAsiaTheme="majorEastAsia" w:hAnsiTheme="majorHAnsi" w:cstheme="majorBidi"/>
         <w:b/>
         <w:bCs/>
       </w:rPr>
@@ -3684,7 +3406,7 @@
         <w:spacing w:before="0" w:after="0" w:line="240" w:lineRule="auto"/>
       </w:pPr>
       <w:rPr>
-        <w:rFonts w:cstheme="majorBidi" w:eastAsia="Heiti SC"/>
+        <w:rFonts w:asciiTheme="majorHAnsi" w:eastAsiaTheme="majorEastAsia" w:hAnsiTheme="majorHAnsi" w:cstheme="majorBidi"/>
         <w:b/>
         <w:bCs/>
       </w:rPr>
@@ -3705,7 +3427,7 @@
         <w:spacing w:before="0" w:after="0" w:line="240" w:lineRule="auto"/>
       </w:pPr>
       <w:rPr>
-        <w:rFonts w:cstheme="majorBidi" w:eastAsia="Heiti SC"/>
+        <w:rFonts w:asciiTheme="majorHAnsi" w:eastAsiaTheme="majorEastAsia" w:hAnsiTheme="majorHAnsi" w:cstheme="majorBidi"/>
         <w:b/>
         <w:bCs/>
       </w:rPr>
@@ -3723,14 +3445,14 @@
     </w:tblStylePr>
     <w:tblStylePr w:type="firstCol">
       <w:rPr>
-        <w:rFonts w:cstheme="majorBidi" w:eastAsia="Heiti SC"/>
+        <w:rFonts w:asciiTheme="majorHAnsi" w:eastAsiaTheme="majorEastAsia" w:hAnsiTheme="majorHAnsi" w:cstheme="majorBidi"/>
         <w:b/>
         <w:bCs/>
       </w:rPr>
     </w:tblStylePr>
     <w:tblStylePr w:type="lastCol">
       <w:rPr>
-        <w:rFonts w:cstheme="majorBidi" w:eastAsia="Heiti SC"/>
+        <w:rFonts w:asciiTheme="majorHAnsi" w:eastAsiaTheme="majorEastAsia" w:hAnsiTheme="majorHAnsi" w:cstheme="majorBidi"/>
         <w:b/>
         <w:bCs/>
       </w:rPr>
@@ -3814,7 +3536,7 @@
         <w:spacing w:before="0" w:after="0" w:line="240" w:lineRule="auto"/>
       </w:pPr>
       <w:rPr>
-        <w:rFonts w:cstheme="majorBidi" w:eastAsia="Heiti SC"/>
+        <w:rFonts w:asciiTheme="majorHAnsi" w:eastAsiaTheme="majorEastAsia" w:hAnsiTheme="majorHAnsi" w:cstheme="majorBidi"/>
         <w:b/>
         <w:bCs/>
       </w:rPr>
@@ -3835,7 +3557,7 @@
         <w:spacing w:before="0" w:after="0" w:line="240" w:lineRule="auto"/>
       </w:pPr>
       <w:rPr>
-        <w:rFonts w:cstheme="majorBidi" w:eastAsia="Heiti SC"/>
+        <w:rFonts w:asciiTheme="majorHAnsi" w:eastAsiaTheme="majorEastAsia" w:hAnsiTheme="majorHAnsi" w:cstheme="majorBidi"/>
         <w:b/>
         <w:bCs/>
       </w:rPr>
@@ -3853,14 +3575,14 @@
     </w:tblStylePr>
     <w:tblStylePr w:type="firstCol">
       <w:rPr>
-        <w:rFonts w:cstheme="majorBidi" w:eastAsia="Heiti SC"/>
+        <w:rFonts w:asciiTheme="majorHAnsi" w:eastAsiaTheme="majorEastAsia" w:hAnsiTheme="majorHAnsi" w:cstheme="majorBidi"/>
         <w:b/>
         <w:bCs/>
       </w:rPr>
     </w:tblStylePr>
     <w:tblStylePr w:type="lastCol">
       <w:rPr>
-        <w:rFonts w:cstheme="majorBidi" w:eastAsia="Heiti SC"/>
+        <w:rFonts w:asciiTheme="majorHAnsi" w:eastAsiaTheme="majorEastAsia" w:hAnsiTheme="majorHAnsi" w:cstheme="majorBidi"/>
         <w:b/>
         <w:bCs/>
       </w:rPr>
@@ -3944,7 +3666,7 @@
         <w:spacing w:before="0" w:after="0" w:line="240" w:lineRule="auto"/>
       </w:pPr>
       <w:rPr>
-        <w:rFonts w:cstheme="majorBidi" w:eastAsia="Heiti SC"/>
+        <w:rFonts w:asciiTheme="majorHAnsi" w:eastAsiaTheme="majorEastAsia" w:hAnsiTheme="majorHAnsi" w:cstheme="majorBidi"/>
         <w:b/>
         <w:bCs/>
       </w:rPr>
@@ -3965,7 +3687,7 @@
         <w:spacing w:before="0" w:after="0" w:line="240" w:lineRule="auto"/>
       </w:pPr>
       <w:rPr>
-        <w:rFonts w:cstheme="majorBidi" w:eastAsia="Heiti SC"/>
+        <w:rFonts w:asciiTheme="majorHAnsi" w:eastAsiaTheme="majorEastAsia" w:hAnsiTheme="majorHAnsi" w:cstheme="majorBidi"/>
         <w:b/>
         <w:bCs/>
       </w:rPr>
@@ -3983,14 +3705,14 @@
     </w:tblStylePr>
     <w:tblStylePr w:type="firstCol">
       <w:rPr>
-        <w:rFonts w:cstheme="majorBidi" w:eastAsia="Heiti SC"/>
+        <w:rFonts w:asciiTheme="majorHAnsi" w:eastAsiaTheme="majorEastAsia" w:hAnsiTheme="majorHAnsi" w:cstheme="majorBidi"/>
         <w:b/>
         <w:bCs/>
       </w:rPr>
     </w:tblStylePr>
     <w:tblStylePr w:type="lastCol">
       <w:rPr>
-        <w:rFonts w:cstheme="majorBidi" w:eastAsia="Heiti SC"/>
+        <w:rFonts w:asciiTheme="majorHAnsi" w:eastAsiaTheme="majorEastAsia" w:hAnsiTheme="majorHAnsi" w:cstheme="majorBidi"/>
         <w:b/>
         <w:bCs/>
       </w:rPr>
@@ -4074,7 +3796,7 @@
         <w:spacing w:before="0" w:after="0" w:line="240" w:lineRule="auto"/>
       </w:pPr>
       <w:rPr>
-        <w:rFonts w:cstheme="majorBidi" w:eastAsia="Heiti SC"/>
+        <w:rFonts w:asciiTheme="majorHAnsi" w:eastAsiaTheme="majorEastAsia" w:hAnsiTheme="majorHAnsi" w:cstheme="majorBidi"/>
         <w:b/>
         <w:bCs/>
       </w:rPr>
@@ -4095,7 +3817,7 @@
         <w:spacing w:before="0" w:after="0" w:line="240" w:lineRule="auto"/>
       </w:pPr>
       <w:rPr>
-        <w:rFonts w:cstheme="majorBidi" w:eastAsia="Heiti SC"/>
+        <w:rFonts w:asciiTheme="majorHAnsi" w:eastAsiaTheme="majorEastAsia" w:hAnsiTheme="majorHAnsi" w:cstheme="majorBidi"/>
         <w:b/>
         <w:bCs/>
       </w:rPr>
@@ -4113,14 +3835,14 @@
     </w:tblStylePr>
     <w:tblStylePr w:type="firstCol">
       <w:rPr>
-        <w:rFonts w:cstheme="majorBidi" w:eastAsia="Heiti SC"/>
+        <w:rFonts w:asciiTheme="majorHAnsi" w:eastAsiaTheme="majorEastAsia" w:hAnsiTheme="majorHAnsi" w:cstheme="majorBidi"/>
         <w:b/>
         <w:bCs/>
       </w:rPr>
     </w:tblStylePr>
     <w:tblStylePr w:type="lastCol">
       <w:rPr>
-        <w:rFonts w:cstheme="majorBidi" w:eastAsia="Heiti SC"/>
+        <w:rFonts w:asciiTheme="majorHAnsi" w:eastAsiaTheme="majorEastAsia" w:hAnsiTheme="majorHAnsi" w:cstheme="majorBidi"/>
         <w:b/>
         <w:bCs/>
       </w:rPr>
@@ -4204,7 +3926,7 @@
         <w:spacing w:before="0" w:after="0" w:line="240" w:lineRule="auto"/>
       </w:pPr>
       <w:rPr>
-        <w:rFonts w:cstheme="majorBidi" w:eastAsia="Heiti SC"/>
+        <w:rFonts w:asciiTheme="majorHAnsi" w:eastAsiaTheme="majorEastAsia" w:hAnsiTheme="majorHAnsi" w:cstheme="majorBidi"/>
         <w:b/>
         <w:bCs/>
       </w:rPr>
@@ -4225,7 +3947,7 @@
         <w:spacing w:before="0" w:after="0" w:line="240" w:lineRule="auto"/>
       </w:pPr>
       <w:rPr>
-        <w:rFonts w:cstheme="majorBidi" w:eastAsia="Heiti SC"/>
+        <w:rFonts w:asciiTheme="majorHAnsi" w:eastAsiaTheme="majorEastAsia" w:hAnsiTheme="majorHAnsi" w:cstheme="majorBidi"/>
         <w:b/>
         <w:bCs/>
       </w:rPr>
@@ -4243,14 +3965,14 @@
     </w:tblStylePr>
     <w:tblStylePr w:type="firstCol">
       <w:rPr>
-        <w:rFonts w:cstheme="majorBidi" w:eastAsia="Heiti SC"/>
+        <w:rFonts w:asciiTheme="majorHAnsi" w:eastAsiaTheme="majorEastAsia" w:hAnsiTheme="majorHAnsi" w:cstheme="majorBidi"/>
         <w:b/>
         <w:bCs/>
       </w:rPr>
     </w:tblStylePr>
     <w:tblStylePr w:type="lastCol">
       <w:rPr>
-        <w:rFonts w:cstheme="majorBidi" w:eastAsia="Heiti SC"/>
+        <w:rFonts w:asciiTheme="majorHAnsi" w:eastAsiaTheme="majorEastAsia" w:hAnsiTheme="majorHAnsi" w:cstheme="majorBidi"/>
         <w:b/>
         <w:bCs/>
       </w:rPr>
@@ -6115,7 +5837,7 @@
     </w:tblPr>
     <w:tblStylePr w:type="firstRow">
       <w:rPr>
-        <w:rFonts w:cstheme="majorBidi" w:eastAsia="Heiti SC"/>
+        <w:rFonts w:asciiTheme="majorHAnsi" w:eastAsiaTheme="majorEastAsia" w:hAnsiTheme="majorHAnsi" w:cstheme="majorBidi"/>
       </w:rPr>
       <w:tblPr/>
       <w:tcPr>
@@ -6199,7 +5921,7 @@
     </w:tblPr>
     <w:tblStylePr w:type="firstRow">
       <w:rPr>
-        <w:rFonts w:cstheme="majorBidi" w:eastAsia="Heiti SC"/>
+        <w:rFonts w:asciiTheme="majorHAnsi" w:eastAsiaTheme="majorEastAsia" w:hAnsiTheme="majorHAnsi" w:cstheme="majorBidi"/>
       </w:rPr>
       <w:tblPr/>
       <w:tcPr>
@@ -6283,7 +6005,7 @@
     </w:tblPr>
     <w:tblStylePr w:type="firstRow">
       <w:rPr>
-        <w:rFonts w:cstheme="majorBidi" w:eastAsia="Heiti SC"/>
+        <w:rFonts w:asciiTheme="majorHAnsi" w:eastAsiaTheme="majorEastAsia" w:hAnsiTheme="majorHAnsi" w:cstheme="majorBidi"/>
       </w:rPr>
       <w:tblPr/>
       <w:tcPr>
@@ -6367,7 +6089,7 @@
     </w:tblPr>
     <w:tblStylePr w:type="firstRow">
       <w:rPr>
-        <w:rFonts w:cstheme="majorBidi" w:eastAsia="Heiti SC"/>
+        <w:rFonts w:asciiTheme="majorHAnsi" w:eastAsiaTheme="majorEastAsia" w:hAnsiTheme="majorHAnsi" w:cstheme="majorBidi"/>
       </w:rPr>
       <w:tblPr/>
       <w:tcPr>
@@ -6451,7 +6173,7 @@
     </w:tblPr>
     <w:tblStylePr w:type="firstRow">
       <w:rPr>
-        <w:rFonts w:cstheme="majorBidi" w:eastAsia="Heiti SC"/>
+        <w:rFonts w:asciiTheme="majorHAnsi" w:eastAsiaTheme="majorEastAsia" w:hAnsiTheme="majorHAnsi" w:cstheme="majorBidi"/>
       </w:rPr>
       <w:tblPr/>
       <w:tcPr>
@@ -6535,7 +6257,7 @@
     </w:tblPr>
     <w:tblStylePr w:type="firstRow">
       <w:rPr>
-        <w:rFonts w:cstheme="majorBidi" w:eastAsia="Heiti SC"/>
+        <w:rFonts w:asciiTheme="majorHAnsi" w:eastAsiaTheme="majorEastAsia" w:hAnsiTheme="majorHAnsi" w:cstheme="majorBidi"/>
       </w:rPr>
       <w:tblPr/>
       <w:tcPr>
@@ -6619,7 +6341,7 @@
     </w:tblPr>
     <w:tblStylePr w:type="firstRow">
       <w:rPr>
-        <w:rFonts w:cstheme="majorBidi" w:eastAsia="Heiti SC"/>
+        <w:rFonts w:asciiTheme="majorHAnsi" w:eastAsiaTheme="majorEastAsia" w:hAnsiTheme="majorHAnsi" w:cstheme="majorBidi"/>
       </w:rPr>
       <w:tblPr/>
       <w:tcPr>
@@ -6684,7 +6406,7 @@
       <w:spacing w:after="0" w:line="240" w:lineRule="auto"/>
     </w:pPr>
     <w:rPr>
-      <w:rFonts w:cstheme="majorBidi" w:eastAsia="Heiti SC"/>
+      <w:rFonts w:asciiTheme="majorHAnsi" w:eastAsiaTheme="majorEastAsia" w:hAnsiTheme="majorHAnsi" w:cstheme="majorBidi"/>
       <w:color w:val="000000" w:themeColor="text1"/>
     </w:rPr>
     <w:tblPr>
@@ -6812,7 +6534,7 @@
       <w:spacing w:after="0" w:line="240" w:lineRule="auto"/>
     </w:pPr>
     <w:rPr>
-      <w:rFonts w:cstheme="majorBidi" w:eastAsia="Heiti SC"/>
+      <w:rFonts w:asciiTheme="majorHAnsi" w:eastAsiaTheme="majorEastAsia" w:hAnsiTheme="majorHAnsi" w:cstheme="majorBidi"/>
       <w:color w:val="000000" w:themeColor="text1"/>
     </w:rPr>
     <w:tblPr>
@@ -6940,7 +6662,7 @@
       <w:spacing w:after="0" w:line="240" w:lineRule="auto"/>
     </w:pPr>
     <w:rPr>
-      <w:rFonts w:cstheme="majorBidi" w:eastAsia="Heiti SC"/>
+      <w:rFonts w:asciiTheme="majorHAnsi" w:eastAsiaTheme="majorEastAsia" w:hAnsiTheme="majorHAnsi" w:cstheme="majorBidi"/>
       <w:color w:val="000000" w:themeColor="text1"/>
     </w:rPr>
     <w:tblPr>
@@ -7068,7 +6790,7 @@
       <w:spacing w:after="0" w:line="240" w:lineRule="auto"/>
     </w:pPr>
     <w:rPr>
-      <w:rFonts w:cstheme="majorBidi" w:eastAsia="Heiti SC"/>
+      <w:rFonts w:asciiTheme="majorHAnsi" w:eastAsiaTheme="majorEastAsia" w:hAnsiTheme="majorHAnsi" w:cstheme="majorBidi"/>
       <w:color w:val="000000" w:themeColor="text1"/>
     </w:rPr>
     <w:tblPr>
@@ -7196,7 +6918,7 @@
       <w:spacing w:after="0" w:line="240" w:lineRule="auto"/>
     </w:pPr>
     <w:rPr>
-      <w:rFonts w:cstheme="majorBidi" w:eastAsia="Heiti SC"/>
+      <w:rFonts w:asciiTheme="majorHAnsi" w:eastAsiaTheme="majorEastAsia" w:hAnsiTheme="majorHAnsi" w:cstheme="majorBidi"/>
       <w:color w:val="000000" w:themeColor="text1"/>
     </w:rPr>
     <w:tblPr>
@@ -7324,7 +7046,7 @@
       <w:spacing w:after="0" w:line="240" w:lineRule="auto"/>
     </w:pPr>
     <w:rPr>
-      <w:rFonts w:cstheme="majorBidi" w:eastAsia="Heiti SC"/>
+      <w:rFonts w:asciiTheme="majorHAnsi" w:eastAsiaTheme="majorEastAsia" w:hAnsiTheme="majorHAnsi" w:cstheme="majorBidi"/>
       <w:color w:val="000000" w:themeColor="text1"/>
     </w:rPr>
     <w:tblPr>
@@ -7452,7 +7174,7 @@
       <w:spacing w:after="0" w:line="240" w:lineRule="auto"/>
     </w:pPr>
     <w:rPr>
-      <w:rFonts w:cstheme="majorBidi" w:eastAsia="Heiti SC"/>
+      <w:rFonts w:asciiTheme="majorHAnsi" w:eastAsiaTheme="majorEastAsia" w:hAnsiTheme="majorHAnsi" w:cstheme="majorBidi"/>
       <w:color w:val="000000" w:themeColor="text1"/>
     </w:rPr>
     <w:tblPr>
@@ -8091,7 +7813,7 @@
       <w:spacing w:after="0" w:line="240" w:lineRule="auto"/>
     </w:pPr>
     <w:rPr>
-      <w:rFonts w:cstheme="majorBidi" w:eastAsia="Heiti SC"/>
+      <w:rFonts w:asciiTheme="majorHAnsi" w:eastAsiaTheme="majorEastAsia" w:hAnsiTheme="majorHAnsi" w:cstheme="majorBidi"/>
       <w:color w:val="000000" w:themeColor="text1"/>
     </w:rPr>
     <w:tblPr>
@@ -8216,7 +7938,7 @@
       <w:spacing w:after="0" w:line="240" w:lineRule="auto"/>
     </w:pPr>
     <w:rPr>
-      <w:rFonts w:cstheme="majorBidi" w:eastAsia="Heiti SC"/>
+      <w:rFonts w:asciiTheme="majorHAnsi" w:eastAsiaTheme="majorEastAsia" w:hAnsiTheme="majorHAnsi" w:cstheme="majorBidi"/>
       <w:color w:val="000000" w:themeColor="text1"/>
     </w:rPr>
     <w:tblPr>
@@ -8341,7 +8063,7 @@
       <w:spacing w:after="0" w:line="240" w:lineRule="auto"/>
     </w:pPr>
     <w:rPr>
-      <w:rFonts w:cstheme="majorBidi" w:eastAsia="Heiti SC"/>
+      <w:rFonts w:asciiTheme="majorHAnsi" w:eastAsiaTheme="majorEastAsia" w:hAnsiTheme="majorHAnsi" w:cstheme="majorBidi"/>
       <w:color w:val="000000" w:themeColor="text1"/>
     </w:rPr>
     <w:tblPr>
@@ -8466,7 +8188,7 @@
       <w:spacing w:after="0" w:line="240" w:lineRule="auto"/>
     </w:pPr>
     <w:rPr>
-      <w:rFonts w:cstheme="majorBidi" w:eastAsia="Heiti SC"/>
+      <w:rFonts w:asciiTheme="majorHAnsi" w:eastAsiaTheme="majorEastAsia" w:hAnsiTheme="majorHAnsi" w:cstheme="majorBidi"/>
       <w:color w:val="000000" w:themeColor="text1"/>
     </w:rPr>
     <w:tblPr>
@@ -8591,7 +8313,7 @@
       <w:spacing w:after="0" w:line="240" w:lineRule="auto"/>
     </w:pPr>
     <w:rPr>
-      <w:rFonts w:cstheme="majorBidi" w:eastAsia="Heiti SC"/>
+      <w:rFonts w:asciiTheme="majorHAnsi" w:eastAsiaTheme="majorEastAsia" w:hAnsiTheme="majorHAnsi" w:cstheme="majorBidi"/>
       <w:color w:val="000000" w:themeColor="text1"/>
     </w:rPr>
     <w:tblPr>
@@ -8716,7 +8438,7 @@
       <w:spacing w:after="0" w:line="240" w:lineRule="auto"/>
     </w:pPr>
     <w:rPr>
-      <w:rFonts w:cstheme="majorBidi" w:eastAsia="Heiti SC"/>
+      <w:rFonts w:asciiTheme="majorHAnsi" w:eastAsiaTheme="majorEastAsia" w:hAnsiTheme="majorHAnsi" w:cstheme="majorBidi"/>
       <w:color w:val="000000" w:themeColor="text1"/>
     </w:rPr>
     <w:tblPr>
@@ -8841,7 +8563,7 @@
       <w:spacing w:after="0" w:line="240" w:lineRule="auto"/>
     </w:pPr>
     <w:rPr>
-      <w:rFonts w:cstheme="majorBidi" w:eastAsia="Heiti SC"/>
+      <w:rFonts w:asciiTheme="majorHAnsi" w:eastAsiaTheme="majorEastAsia" w:hAnsiTheme="majorHAnsi" w:cstheme="majorBidi"/>
       <w:color w:val="000000" w:themeColor="text1"/>
     </w:rPr>
     <w:tblPr>

</xml_diff>